<commit_message>
fix: improve grading logic and update import template
- Normalize multiple choice input matching to be case-insensitive and prefix-aware
- Synchronize grading logic between GuruPanel and SiswaPanel
- Update Word template documentation for clearer question formatting
</commit_message>
<xml_diff>
--- a/public/template_soal.docx
+++ b/public/template_soal.docx
@@ -36,7 +36,7 @@
           <w:sz w:val="20"/>
           <w:szCs w:val="20"/>
         </w:rPr>
-        <w:t xml:space="preserve">• Awali setiap nomor butir soal dengan angka dan tanda titik, contoh: "1. Pertanyaan...", "2. Pertanyaan..."
+        <w:t xml:space="preserve">• Awali setiap nomor butir soal dengan angka dan titik, contoh: "1. Pertanyaan...", "2. Pertanyaan..."
 </w:t>
       </w:r>
       <w:r>
@@ -44,7 +44,7 @@
           <w:sz w:val="20"/>
           <w:szCs w:val="20"/>
         </w:rPr>
-        <w:t xml:space="preserve">• Untuk Pilihan Ganda: tuliskan pilihan jawaban diawali huruf kapital dan titik: "A. Pilihan...", "B. Pilihan...", "C. ...", "D. ...", "E. ..."
+        <w:t xml:space="preserve">• Pilihan Ganda (PG): Tuliskan opsi diawali huruf dan titik: "A. Opsi...", "B. Opsi...", "C. ...", "D. ...". Kunci: "Kunci: A" (atau "Kunci: B").
 </w:t>
       </w:r>
       <w:r>
@@ -52,7 +52,7 @@
           <w:sz w:val="20"/>
           <w:szCs w:val="20"/>
         </w:rPr>
-        <w:t xml:space="preserve">• Kunci jawaban ditulis di baris baru di bawah pilihan dengan format: "Kunci: A" (atau "Kunci: B", dsb).
+        <w:t xml:space="preserve">• Pilihan Ganda Kompleks (PGK): Awali soal dengan [Pilihan Ganda Kompleks], kunci lebih dari satu: "Kunci: A, C".
 </w:t>
       </w:r>
       <w:r>
@@ -60,9 +60,120 @@
           <w:sz w:val="20"/>
           <w:szCs w:val="20"/>
         </w:rPr>
-        <w:t xml:space="preserve">• Untuk Soal Esai / Uraian: tulis pertanyaan soal, lalu di baris berikutnya tulis "Kunci: [pembahasan / kata kunci jawaban]".
+        <w:t xml:space="preserve">• Benar-Salah: Awali soal dengan [Benar-Salah], kunci format: "Kunci: Benar" atau "Kunci: Salah".
 </w:t>
       </w:r>
+      <w:r>
+        <w:rPr>
+          <w:sz w:val="20"/>
+          <w:szCs w:val="20"/>
+        </w:rPr>
+        <w:t xml:space="preserve">• Menjodohkan: Awali soal dengan [Menjodohkan], lalu tuliskan pasangan dengan tanda sama dengan (=), contoh: "Indonesia = Jakarta".
+</w:t>
+      </w:r>
+      <w:r>
+        <w:rPr>
+          <w:sz w:val="20"/>
+          <w:szCs w:val="20"/>
+        </w:rPr>
+        <w:t xml:space="preserve">• Isian Singkat: Awali soal dengan [Isian], kunci berupa jawaban kata/frasa singkat, contoh: "Kunci: Nusantara".
+</w:t>
+      </w:r>
+      <w:r>
+        <w:rPr>
+          <w:sz w:val="20"/>
+          <w:szCs w:val="20"/>
+        </w:rPr>
+        <w:t xml:space="preserve">• Uraian / Esai: Awali soal dengan [Uraian] atau [Essay], kunci berupa pembahasan / rubrik jawaban.
+</w:t>
+      </w:r>
+      <w:r>
+        <w:rPr>
+          <w:sz w:val="20"/>
+          <w:szCs w:val="20"/>
+        </w:rPr>
+        <w:t xml:space="preserve">• Bobot nilai dan pembahasan dapat ditambahkan: "Bobot: 10", "Pembahasan: ...".
+</w:t>
+      </w:r>
+    </w:p>
+    <w:p>
+      <w:pPr>
+        <w:spacing w:after="300"/>
+        <w:jc w:val="center"/>
+      </w:pPr>
+      <w:r>
+        <w:t xml:space="preserve">==================== CONTOH BUTIR SOAL ====================</w:t>
+      </w:r>
+    </w:p>
+    <w:p>
+      <w:pPr>
+        <w:spacing w:after="100" w:before="150"/>
+      </w:pPr>
+      <w:r>
+        <w:rPr>
+          <w:b/>
+          <w:bCs/>
+          <w:sz w:val="22"/>
+          <w:szCs w:val="22"/>
+        </w:rPr>
+        <w:t xml:space="preserve">1. [Pilihan Ganda] Organel sel yang berfungsi sebagai tempat berlangsungnya respirasi seluler dan menghasilkan energi dalam bentuk ATP adalah...</w:t>
+      </w:r>
+    </w:p>
+    <w:p>
+      <w:r>
+        <w:rPr>
+          <w:sz w:val="21"/>
+          <w:szCs w:val="21"/>
+        </w:rPr>
+        <w:t xml:space="preserve">A. Ribosom</w:t>
+      </w:r>
+    </w:p>
+    <w:p>
+      <w:r>
+        <w:rPr>
+          <w:sz w:val="21"/>
+          <w:szCs w:val="21"/>
+        </w:rPr>
+        <w:t xml:space="preserve">B. Mitokondria</w:t>
+      </w:r>
+    </w:p>
+    <w:p>
+      <w:r>
+        <w:rPr>
+          <w:sz w:val="21"/>
+          <w:szCs w:val="21"/>
+        </w:rPr>
+        <w:t xml:space="preserve">C. Badan Golgi</w:t>
+      </w:r>
+    </w:p>
+    <w:p>
+      <w:r>
+        <w:rPr>
+          <w:sz w:val="21"/>
+          <w:szCs w:val="21"/>
+        </w:rPr>
+        <w:t xml:space="preserve">D. Retikulum Endoplasma</w:t>
+      </w:r>
+    </w:p>
+    <w:p>
+      <w:pPr>
+        <w:spacing w:after="100" w:before="80"/>
+      </w:pPr>
+      <w:r>
+        <w:rPr>
+          <w:b/>
+          <w:bCs/>
+          <w:color w:val="15803D"/>
+          <w:sz w:val="21"/>
+          <w:szCs w:val="21"/>
+        </w:rPr>
+        <w:t xml:space="preserve">Kunci: B</w:t>
+      </w:r>
+    </w:p>
+    <w:p>
+      <w:pPr>
+        <w:spacing w:after="250"/>
+      </w:pPr>
       <w:r>
         <w:rPr>
           <w:i/>
@@ -70,16 +181,7 @@
           <w:sz w:val="20"/>
           <w:szCs w:val="20"/>
         </w:rPr>
-        <w:t xml:space="preserve">• Simpan file dalam format .docx atau .doc lalu unggah melalui tombol "Impor Word" di menu Bank Soal CBT.</w:t>
-      </w:r>
-    </w:p>
-    <w:p>
-      <w:pPr>
-        <w:spacing w:after="300"/>
-        <w:jc w:val="center"/>
-      </w:pPr>
-      <w:r>
-        <w:t xml:space="preserve">==================== CONTOH BUTIR SOAL ====================</w:t>
+        <w:t xml:space="preserve">Pembahasan: Mitokondria merupakan the powerhouse of cell penghasil energi ATP.</w:t>
       </w:r>
     </w:p>
     <w:p>
@@ -93,43 +195,43 @@
           <w:sz w:val="22"/>
           <w:szCs w:val="22"/>
         </w:rPr>
-        <w:t xml:space="preserve">1. Organel sel yang berfungsi sebagai tempat berlangsungnya respirasi seluler dan menghasilkan energi dalam bentuk ATP adalah...</w:t>
-      </w:r>
-    </w:p>
-    <w:p>
-      <w:r>
-        <w:rPr>
-          <w:sz w:val="21"/>
-          <w:szCs w:val="21"/>
-        </w:rPr>
-        <w:t xml:space="preserve">A. Ribosom</w:t>
-      </w:r>
-    </w:p>
-    <w:p>
-      <w:r>
-        <w:rPr>
-          <w:sz w:val="21"/>
-          <w:szCs w:val="21"/>
-        </w:rPr>
-        <w:t xml:space="preserve">B. Mitokondria</w:t>
-      </w:r>
-    </w:p>
-    <w:p>
-      <w:r>
-        <w:rPr>
-          <w:sz w:val="21"/>
-          <w:szCs w:val="21"/>
-        </w:rPr>
-        <w:t xml:space="preserve">C. Badan Golgi</w:t>
-      </w:r>
-    </w:p>
-    <w:p>
-      <w:r>
-        <w:rPr>
-          <w:sz w:val="21"/>
-          <w:szCs w:val="21"/>
-        </w:rPr>
-        <w:t xml:space="preserve">D. Retikulum Endoplasma</w:t>
+        <w:t xml:space="preserve">2. [Pilihan Ganda Kompleks] Manakah dari pernyataan di bawah ini yang merupakan ciri-ciri makhluk hidup? (Pilihlah jawaban yang benar)</w:t>
+      </w:r>
+    </w:p>
+    <w:p>
+      <w:r>
+        <w:rPr>
+          <w:sz w:val="21"/>
+          <w:szCs w:val="21"/>
+        </w:rPr>
+        <w:t xml:space="preserve">A. Memerlukan nutrisi/makanan</w:t>
+      </w:r>
+    </w:p>
+    <w:p>
+      <w:r>
+        <w:rPr>
+          <w:sz w:val="21"/>
+          <w:szCs w:val="21"/>
+        </w:rPr>
+        <w:t xml:space="preserve">B. Mampu berkembang biak (reproduksi)</w:t>
+      </w:r>
+    </w:p>
+    <w:p>
+      <w:r>
+        <w:rPr>
+          <w:sz w:val="21"/>
+          <w:szCs w:val="21"/>
+        </w:rPr>
+        <w:t xml:space="preserve">C. Tidak peka terhadap rangsang</w:t>
+      </w:r>
+    </w:p>
+    <w:p>
+      <w:r>
+        <w:rPr>
+          <w:sz w:val="21"/>
+          <w:szCs w:val="21"/>
+        </w:rPr>
+        <w:t xml:space="preserve">D. Melakukan ekskresi (pengeluaran zat sisa)</w:t>
       </w:r>
     </w:p>
     <w:p>
@@ -144,7 +246,7 @@
           <w:sz w:val="21"/>
           <w:szCs w:val="21"/>
         </w:rPr>
-        <w:t xml:space="preserve">Kunci: B</w:t>
+        <w:t xml:space="preserve">Kunci: A, B, D</w:t>
       </w:r>
     </w:p>
     <w:p>
@@ -158,43 +260,7 @@
           <w:sz w:val="22"/>
           <w:szCs w:val="22"/>
         </w:rPr>
-        <w:t xml:space="preserve">2. Danau Toba terbentuk akibat letusan gunung berapi supervulkanik purba yang sangat dahsyat ribuan tahun lalu yang kemudian amblas dan terisi air. Danau dengan proses pembentukan seperti ini diklasifikasikan sebagai danau jenis...</w:t>
-      </w:r>
-    </w:p>
-    <w:p>
-      <w:r>
-        <w:rPr>
-          <w:sz w:val="21"/>
-          <w:szCs w:val="21"/>
-        </w:rPr>
-        <w:t xml:space="preserve">A. Danau Tektonik murni</w:t>
-      </w:r>
-    </w:p>
-    <w:p>
-      <w:r>
-        <w:rPr>
-          <w:sz w:val="21"/>
-          <w:szCs w:val="21"/>
-        </w:rPr>
-        <w:t xml:space="preserve">B. Danau Vulkanik kepundan</w:t>
-      </w:r>
-    </w:p>
-    <w:p>
-      <w:r>
-        <w:rPr>
-          <w:sz w:val="21"/>
-          <w:szCs w:val="21"/>
-        </w:rPr>
-        <w:t xml:space="preserve">C. Danau Tekto-Vulkanik</w:t>
-      </w:r>
-    </w:p>
-    <w:p>
-      <w:r>
-        <w:rPr>
-          <w:sz w:val="21"/>
-          <w:szCs w:val="21"/>
-        </w:rPr>
-        <w:t xml:space="preserve">D. Danau Karst (Dolina)</w:t>
+        <w:t xml:space="preserve">3. [Benar-Salah] Danau Toba merupakan danau tekto-vulkanik terbesar di Indonesia yang terbentuk dari letusan supervulkan purba.</w:t>
       </w:r>
     </w:p>
     <w:p>
@@ -209,7 +275,7 @@
           <w:sz w:val="21"/>
           <w:szCs w:val="21"/>
         </w:rPr>
-        <w:t xml:space="preserve">Kunci: C</w:t>
+        <w:t xml:space="preserve">Kunci: Benar</w:t>
       </w:r>
     </w:p>
     <w:p>
@@ -223,43 +289,43 @@
           <w:sz w:val="22"/>
           <w:szCs w:val="22"/>
         </w:rPr>
-        <w:t xml:space="preserve">3. Perhatikan faktor-faktor berikut: suhu lingkungan, konsentrasi reaktan, penambahan katalis, dan luas permukaan bidang sentuh. Faktor yang dapat mempercepat terjadinya laju reaksi kimia adalah...</w:t>
-      </w:r>
-    </w:p>
-    <w:p>
-      <w:r>
-        <w:rPr>
-          <w:sz w:val="21"/>
-          <w:szCs w:val="21"/>
-        </w:rPr>
-        <w:t xml:space="preserve">A. Suhu dan luas permukaan bidang sentuh saja</w:t>
-      </w:r>
-    </w:p>
-    <w:p>
-      <w:r>
-        <w:rPr>
-          <w:sz w:val="21"/>
-          <w:szCs w:val="21"/>
-        </w:rPr>
-        <w:t xml:space="preserve">B. Konsentrasi dan penambahan katalis saja</w:t>
-      </w:r>
-    </w:p>
-    <w:p>
-      <w:r>
-        <w:rPr>
-          <w:sz w:val="21"/>
-          <w:szCs w:val="21"/>
-        </w:rPr>
-        <w:t xml:space="preserve">C. Semua faktor di atas dapat mempercepat laju reaksi</w:t>
-      </w:r>
-    </w:p>
-    <w:p>
-      <w:r>
-        <w:rPr>
-          <w:sz w:val="21"/>
-          <w:szCs w:val="21"/>
-        </w:rPr>
-        <w:t xml:space="preserve">D. Hanya suhu yang berpengaruh terhadap energi aktivasi</w:t>
+        <w:t xml:space="preserve">4. [Menjodohkan] Pasangkan organel sel berikut dengan fungsinya masing-masing secara tepat:</w:t>
+      </w:r>
+    </w:p>
+    <w:p>
+      <w:r>
+        <w:rPr>
+          <w:sz w:val="21"/>
+          <w:szCs w:val="21"/>
+        </w:rPr>
+        <w:t xml:space="preserve">Mitokondria = Respirasi seluler &amp; pembentukan ATP</w:t>
+      </w:r>
+    </w:p>
+    <w:p>
+      <w:r>
+        <w:rPr>
+          <w:sz w:val="21"/>
+          <w:szCs w:val="21"/>
+        </w:rPr>
+        <w:t xml:space="preserve">Ribosom = Tempat sintesis protein</w:t>
+      </w:r>
+    </w:p>
+    <w:p>
+      <w:r>
+        <w:rPr>
+          <w:sz w:val="21"/>
+          <w:szCs w:val="21"/>
+        </w:rPr>
+        <w:t xml:space="preserve">Kloroplas = Fotosintesis pada tumbuhan</w:t>
+      </w:r>
+    </w:p>
+    <w:p>
+      <w:r>
+        <w:rPr>
+          <w:sz w:val="21"/>
+          <w:szCs w:val="21"/>
+        </w:rPr>
+        <w:t xml:space="preserve">Nukleus = Pusat pengendali aktivitas genetik sel</w:t>
       </w:r>
     </w:p>
     <w:p>
@@ -270,11 +336,10 @@
         <w:rPr>
           <w:b/>
           <w:bCs/>
-          <w:color w:val="15803D"/>
-          <w:sz w:val="21"/>
-          <w:szCs w:val="21"/>
-        </w:rPr>
-        <w:t xml:space="preserve">Kunci: C</w:t>
+          <w:sz w:val="20"/>
+          <w:szCs w:val="20"/>
+        </w:rPr>
+        <w:t xml:space="preserve">Bobot: 15</w:t>
       </w:r>
     </w:p>
     <w:p>
@@ -288,7 +353,7 @@
           <w:sz w:val="22"/>
           <w:szCs w:val="22"/>
         </w:rPr>
-        <w:t xml:space="preserve">4. Jelaskan perbedaan mendasar antara sel hewan dan sel tumbuhan beserta fungsi organel kloroplas dalam proses fotosintesis!</w:t>
+        <w:t xml:space="preserve">5. [Isian] Ibukota negara Republik Indonesia yang baru dan berlokasi di Kalimantan Timur bernama...</w:t>
       </w:r>
     </w:p>
     <w:p>
@@ -303,7 +368,7 @@
           <w:sz w:val="21"/>
           <w:szCs w:val="21"/>
         </w:rPr>
-        <w:t xml:space="preserve">Kunci: Sel tumbuhan memiliki dinding sel yang kaku, plastida/kloroplas, dan vakuola berukuran besar. Sedangkan sel hewan tidak memiliki dinding sel dan plastida melainkan memiliki sentriol. Kloroplas berfungsi menangkap energi cahaya matahari untuk mengubah CO2 dan H2O menjadi glukosa dan oksigen.</w:t>
+        <w:t xml:space="preserve">Kunci: Nusantara</w:t>
       </w:r>
     </w:p>
     <w:p>
@@ -317,12 +382,12 @@
           <w:sz w:val="22"/>
           <w:szCs w:val="22"/>
         </w:rPr>
-        <w:t xml:space="preserve">5. Sebutkan dan berikan contoh konkret penerapan nilai kemanusiaan yang adil dan beradab (Sila ke-2 Pancasila) di lingkungan sekolah!</w:t>
-      </w:r>
-    </w:p>
-    <w:p>
-      <w:pPr>
-        <w:spacing w:after="200" w:before="80"/>
+        <w:t xml:space="preserve">6. [Uraian] Jelaskan perbedaan mendasar antara sel hewan dan sel tumbuhan beserta fungsi organel kloroplas dalam proses fotosintesis!</w:t>
+      </w:r>
+    </w:p>
+    <w:p>
+      <w:pPr>
+        <w:spacing w:after="100" w:before="80"/>
       </w:pPr>
       <w:r>
         <w:rPr>
@@ -332,7 +397,21 @@
           <w:sz w:val="21"/>
           <w:szCs w:val="21"/>
         </w:rPr>
-        <w:t xml:space="preserve">Kunci: Menghargai hak asasi sesama teman tanpa membeda-bedakan suku, agama, dan latar belakang, tidak melakukan perundungan (bullying), serta bersikap saling tolong-menolong ketika ada warga sekolah yang tertimpa musibah.</w:t>
+        <w:t xml:space="preserve">Kunci: Sel tumbuhan memiliki dinding sel yang kaku, plastida/kloroplas, dan vakuola berukuran besar. Sedangkan sel hewan tidak memiliki dinding sel dan plastida melainkan memiliki sentriol. Kloroplas berfungsi menangkap energi cahaya matahari untuk fotosintesis.</w:t>
+      </w:r>
+    </w:p>
+    <w:p>
+      <w:pPr>
+        <w:spacing w:after="200"/>
+      </w:pPr>
+      <w:r>
+        <w:rPr>
+          <w:b/>
+          <w:bCs/>
+          <w:sz w:val="20"/>
+          <w:szCs w:val="20"/>
+        </w:rPr>
+        <w:t xml:space="preserve">Bobot: 20</w:t>
       </w:r>
     </w:p>
     <w:sectPr>

</xml_diff>